<commit_message>
refactor(labs): name each activity folder "NN - Title" in the house convention
Renames the per-lab folders from lab-NN-<slug>/ to the convention used across
the other Tertiary courses — "01 - The Green Belt Role, Project Selection and
Business Case" — so the Activities folder reads the same way in Google Drive,
on GitHub and in the Learner Guide.

Link targets in the generated Markdown are now percent-encoded, since the
readable folder names contain spaces, commas and parentheses and an unencoded
"(" would otherwise truncate a Markdown link (it broke the Lab 2 link).

The superseded lab-NN-<slug>/ folders are removed; their content is identical
to the renamed folders and remains in history at 9851016.

Co-Authored-By: Claude Opus 5 <noreply@anthropic.com>
</commit_message>
<xml_diff>
--- a/courseware/LG-Certified Lean Six Sigma Green Belt (CLSSGB) Training.docx
+++ b/courseware/LG-Certified Lean Six Sigma Green Belt (CLSSGB) Training.docx
@@ -608,7 +608,7 @@
         </w:rPr>
         <w:t>Introduction</w:t>
         <w:tab/>
-        <w:t>4</w:t>
+        <w:t>5</w:t>
       </w:r>
     </w:p>
     <w:p>
@@ -627,7 +627,7 @@
         </w:rPr>
         <w:t>Course Learning Outcomes</w:t>
         <w:tab/>
-        <w:t>4</w:t>
+        <w:t>5</w:t>
       </w:r>
     </w:p>
     <w:p>
@@ -646,7 +646,7 @@
         </w:rPr>
         <w:t>Skills Framework Alignment</w:t>
         <w:tab/>
-        <w:t>4</w:t>
+        <w:t>5</w:t>
       </w:r>
     </w:p>
     <w:p>
@@ -665,7 +665,7 @@
         </w:rPr>
         <w:t>Before You Start</w:t>
         <w:tab/>
-        <w:t>4</w:t>
+        <w:t>6</w:t>
       </w:r>
     </w:p>
     <w:p>
@@ -684,7 +684,7 @@
         </w:rPr>
         <w:t>FOUNDATIONS — Six Sigma Foundations &amp; The Green Belt Role  (10%)</w:t>
         <w:tab/>
-        <w:t>4</w:t>
+        <w:t>7</w:t>
       </w:r>
     </w:p>
     <w:p>
@@ -704,7 +704,7 @@
         </w:rPr>
         <w:t>Lab 1 — The Green Belt Role, Project Selection and Business Case  [Core]</w:t>
         <w:tab/>
-        <w:t>4</w:t>
+        <w:t>7</w:t>
       </w:r>
     </w:p>
     <w:p>
@@ -724,7 +724,7 @@
         </w:rPr>
         <w:t>Lab 2 — Y = f(X), Sigma Level, DPMO and the DMAIC Roadmap  [Core]</w:t>
         <w:tab/>
-        <w:t>4</w:t>
+        <w:t>9</w:t>
       </w:r>
     </w:p>
     <w:p>
@@ -743,7 +743,7 @@
         </w:rPr>
         <w:t>DEFINE — Define — Scope the Problem  (18%)</w:t>
         <w:tab/>
-        <w:t>4</w:t>
+        <w:t>10</w:t>
       </w:r>
     </w:p>
     <w:p>
@@ -763,7 +763,7 @@
         </w:rPr>
         <w:t>Lab 3 — Voice of the Customer, Affinity Diagram and Kano Analysis  [Core]</w:t>
         <w:tab/>
-        <w:t>4</w:t>
+        <w:t>11</w:t>
       </w:r>
     </w:p>
     <w:p>
@@ -783,7 +783,7 @@
         </w:rPr>
         <w:t>Lab 4 — CTQ Tree — Translating Customer Needs into Measurable Requirements  [Core]</w:t>
         <w:tab/>
-        <w:t>4</w:t>
+        <w:t>12</w:t>
       </w:r>
     </w:p>
     <w:p>
@@ -803,7 +803,7 @@
         </w:rPr>
         <w:t>Lab 5 — Project Charter, Problem Statement, Goal Statement and Scope  [Core]</w:t>
         <w:tab/>
-        <w:t>4</w:t>
+        <w:t>14</w:t>
       </w:r>
     </w:p>
     <w:p>
@@ -823,7 +823,7 @@
         </w:rPr>
         <w:t>Lab 6 — SIPOC, Stakeholder Analysis and RACI  [Core]</w:t>
         <w:tab/>
-        <w:t>4</w:t>
+        <w:t>15</w:t>
       </w:r>
     </w:p>
     <w:p>
@@ -842,7 +842,7 @@
         </w:rPr>
         <w:t>MEASURE — Measure — Quantify Performance  (24%)</w:t>
         <w:tab/>
-        <w:t>4</w:t>
+        <w:t>17</w:t>
       </w:r>
     </w:p>
     <w:p>
@@ -862,7 +862,7 @@
         </w:rPr>
         <w:t>Lab 7 — Detailed Process Mapping and Swimlane Analysis  [Core]</w:t>
         <w:tab/>
-        <w:t>4</w:t>
+        <w:t>18</w:t>
       </w:r>
     </w:p>
     <w:p>
@@ -882,7 +882,7 @@
         </w:rPr>
         <w:t>Lab 8 — Value Stream Mapping, Takt Time and the Eight Wastes  [Core]</w:t>
         <w:tab/>
-        <w:t>4</w:t>
+        <w:t>19</w:t>
       </w:r>
     </w:p>
     <w:p>
@@ -902,7 +902,7 @@
         </w:rPr>
         <w:t>Lab 9 — Data Types, Operational Definitions and the Data Collection Plan  [Core]</w:t>
         <w:tab/>
-        <w:t>4</w:t>
+        <w:t>21</w:t>
       </w:r>
     </w:p>
     <w:p>
@@ -922,7 +922,7 @@
         </w:rPr>
         <w:t>Lab 10 — Sampling Techniques and Sample Size Calculation  [Core]</w:t>
         <w:tab/>
-        <w:t>4</w:t>
+        <w:t>23</w:t>
       </w:r>
     </w:p>
     <w:p>
@@ -942,7 +942,7 @@
         </w:rPr>
         <w:t>Lab 11 — Measurement System Analysis and Gage R&amp;R  [Core]</w:t>
         <w:tab/>
-        <w:t>4</w:t>
+        <w:t>24</w:t>
       </w:r>
     </w:p>
     <w:p>
@@ -962,7 +962,7 @@
         </w:rPr>
         <w:t>Lab 12 — Yield, DPU, DPO, DPMO, RTY and the Hidden Factory  [Core]</w:t>
         <w:tab/>
-        <w:t>4</w:t>
+        <w:t>26</w:t>
       </w:r>
     </w:p>
     <w:p>
@@ -982,7 +982,7 @@
         </w:rPr>
         <w:t>Lab 13 — Descriptive Statistics, Normality and Baseline Process Capability  [Core]</w:t>
         <w:tab/>
-        <w:t>4</w:t>
+        <w:t>28</w:t>
       </w:r>
     </w:p>
     <w:p>
@@ -1001,7 +1001,7 @@
         </w:rPr>
         <w:t>ANALYZE — Analyze — Find and Prove the Root Cause  (26%)</w:t>
         <w:tab/>
-        <w:t>4</w:t>
+        <w:t>30</w:t>
       </w:r>
     </w:p>
     <w:p>
@@ -1021,7 +1021,7 @@
         </w:rPr>
         <w:t>Lab 14 — Variation, Run Charts and Stability Analysis  [Core]</w:t>
         <w:tab/>
-        <w:t>4</w:t>
+        <w:t>30</w:t>
       </w:r>
     </w:p>
     <w:p>
@@ -1041,7 +1041,7 @@
         </w:rPr>
         <w:t>Lab 15 — Pareto Analysis, Stratification and Boxplots  [Core]</w:t>
         <w:tab/>
-        <w:t>4</w:t>
+        <w:t>32</w:t>
       </w:r>
     </w:p>
     <w:p>
@@ -1061,7 +1061,7 @@
         </w:rPr>
         <w:t>Lab 16 — Fishbone, 5 Whys, Multi-Voting and Cause Prioritisation  [Core]</w:t>
         <w:tab/>
-        <w:t>4</w:t>
+        <w:t>34</w:t>
       </w:r>
     </w:p>
     <w:p>
@@ -1081,7 +1081,7 @@
         </w:rPr>
         <w:t>Lab 17 — Hypothesis Testing — Test Selection, p-values and Conclusions  [Core]</w:t>
         <w:tab/>
-        <w:t>4</w:t>
+        <w:t>36</w:t>
       </w:r>
     </w:p>
     <w:p>
@@ -1101,7 +1101,7 @@
         </w:rPr>
         <w:t>Lab 18 — Correlation, Regression and Quantifying the X-Y Relationship  [Core]</w:t>
         <w:tab/>
-        <w:t>4</w:t>
+        <w:t>38</w:t>
       </w:r>
     </w:p>
     <w:p>
@@ -1120,7 +1120,7 @@
         </w:rPr>
         <w:t>IMPROVE — Improve — Select, De-Risk and Pilot the Fix  (12%)</w:t>
         <w:tab/>
-        <w:t>4</w:t>
+        <w:t>40</w:t>
       </w:r>
     </w:p>
     <w:p>
@@ -1140,7 +1140,7 @@
         </w:rPr>
         <w:t>Lab 19 — Solution Generation, Benchmarking and Brainwriting  [Core]</w:t>
         <w:tab/>
-        <w:t>4</w:t>
+        <w:t>41</w:t>
       </w:r>
     </w:p>
     <w:p>
@@ -1160,7 +1160,7 @@
         </w:rPr>
         <w:t>Lab 20 — Lean Countermeasures — 5S, Poka-Yoke, Pull, JIT and Standard Work  [Core]</w:t>
         <w:tab/>
-        <w:t>4</w:t>
+        <w:t>42</w:t>
       </w:r>
     </w:p>
     <w:p>
@@ -1180,7 +1180,7 @@
         </w:rPr>
         <w:t>Lab 21 — Solution Selection Matrix and Cost-Benefit Analysis  [Core]</w:t>
         <w:tab/>
-        <w:t>4</w:t>
+        <w:t>44</w:t>
       </w:r>
     </w:p>
     <w:p>
@@ -1200,7 +1200,7 @@
         </w:rPr>
         <w:t>Lab 22 — FMEA, Risk Priority Numbers, DOE and Piloting  [Core]</w:t>
         <w:tab/>
-        <w:t>4</w:t>
+        <w:t>46</w:t>
       </w:r>
     </w:p>
     <w:p>
@@ -1219,7 +1219,7 @@
         </w:rPr>
         <w:t>CONTROL — Control — Hold the Gain  (10%)</w:t>
         <w:tab/>
-        <w:t>4</w:t>
+        <w:t>48</w:t>
       </w:r>
     </w:p>
     <w:p>
@@ -1239,7 +1239,7 @@
         </w:rPr>
         <w:t>Lab 23 — Statistical Process Control — Chart Selection and Control Limits  [Core]</w:t>
         <w:tab/>
-        <w:t>4</w:t>
+        <w:t>49</w:t>
       </w:r>
     </w:p>
     <w:p>
@@ -1259,7 +1259,7 @@
         </w:rPr>
         <w:t>Lab 24 — Control Plan, SOP, Visual Management and Response Plan  [Core]</w:t>
         <w:tab/>
-        <w:t>4</w:t>
+        <w:t>51</w:t>
       </w:r>
     </w:p>
     <w:p>
@@ -1279,7 +1279,7 @@
         </w:rPr>
         <w:t>Lab 25 — Verify the Gain, A3 Storyboard, Handover and Project Closure  [Core]</w:t>
         <w:tab/>
-        <w:t>4</w:t>
+        <w:t>53</w:t>
       </w:r>
     </w:p>
     <w:p>
@@ -1298,7 +1298,7 @@
         </w:rPr>
         <w:t>Quick Reference — Formulas You Should Know</w:t>
         <w:tab/>
-        <w:t>5</w:t>
+        <w:t>55</w:t>
       </w:r>
     </w:p>
     <w:p>
@@ -1317,7 +1317,7 @@
         </w:rPr>
         <w:t>Quick Reference — The Eight Wastes (DOWNTIME)</w:t>
         <w:tab/>
-        <w:t>5</w:t>
+        <w:t>56</w:t>
       </w:r>
     </w:p>
     <w:p>
@@ -1336,7 +1336,7 @@
         </w:rPr>
         <w:t>Preparing for the Assessment</w:t>
         <w:tab/>
-        <w:t>5</w:t>
+        <w:t>56</w:t>
       </w:r>
     </w:p>
     <w:p>
@@ -1355,7 +1355,7 @@
         </w:rPr>
         <w:t>Glossary</w:t>
         <w:tab/>
-        <w:t>5</w:t>
+        <w:t>57</w:t>
       </w:r>
     </w:p>
     <w:p>
@@ -2060,7 +2060,7 @@
         <w:rPr>
           <w:sz w:val="20"/>
         </w:rPr>
-        <w:t>The full worksheet and the data files for this lab are in labs/lab-01-the-green-belt-role-project-selection-and-business-case/.</w:t>
+        <w:t>The full worksheet and the data files for this lab are in labs/01 - The Green Belt Role, Project Selection and Business Case/.</w:t>
       </w:r>
     </w:p>
     <w:p/>
@@ -2309,7 +2309,7 @@
         <w:rPr>
           <w:sz w:val="20"/>
         </w:rPr>
-        <w:t>The full worksheet and the data files for this lab are in labs/lab-02-y-fx-sigma-level-dpmo-and-the-dmaic-roadmap/.</w:t>
+        <w:t>The full worksheet and the data files for this lab are in labs/02 - Y = f(X), Sigma Level, DPMO and the DMAIC Roadmap/.</w:t>
       </w:r>
     </w:p>
     <w:p/>
@@ -2645,7 +2645,7 @@
         <w:rPr>
           <w:sz w:val="20"/>
         </w:rPr>
-        <w:t>The full worksheet and the data files for this lab are in labs/lab-03-voice-of-the-customer-affinity-diagram-and-kano-analysis/.</w:t>
+        <w:t>The full worksheet and the data files for this lab are in labs/03 - Voice of the Customer, Affinity Diagram and Kano Analysis/.</w:t>
       </w:r>
     </w:p>
     <w:p/>
@@ -2894,7 +2894,7 @@
         <w:rPr>
           <w:sz w:val="20"/>
         </w:rPr>
-        <w:t>The full worksheet and the data files for this lab are in labs/lab-04-ctq-tree-translating-customer-needs-into-measurable-requirem/.</w:t>
+        <w:t>The full worksheet and the data files for this lab are in labs/04 - CTQ Tree — Translating Customer Needs into Measurable Requirements/.</w:t>
       </w:r>
     </w:p>
     <w:p/>
@@ -3158,7 +3158,7 @@
         <w:rPr>
           <w:sz w:val="20"/>
         </w:rPr>
-        <w:t>The full worksheet and the data files for this lab are in labs/lab-05-project-charter-problem-statement-goal-statement-and-scope/.</w:t>
+        <w:t>The full worksheet and the data files for this lab are in labs/05 - Project Charter, Problem Statement, Goal Statement and Scope/.</w:t>
       </w:r>
     </w:p>
     <w:p/>
@@ -3477,7 +3477,7 @@
         <w:rPr>
           <w:sz w:val="20"/>
         </w:rPr>
-        <w:t>The full worksheet and the data files for this lab are in labs/lab-06-sipoc-stakeholder-analysis-and-raci/.</w:t>
+        <w:t>The full worksheet and the data files for this lab are in labs/06 - SIPOC, Stakeholder Analysis and RACI/.</w:t>
       </w:r>
     </w:p>
     <w:p/>
@@ -3861,7 +3861,7 @@
         <w:rPr>
           <w:sz w:val="20"/>
         </w:rPr>
-        <w:t>The full worksheet and the data files for this lab are in labs/lab-07-detailed-process-mapping-and-swimlane-analysis/.</w:t>
+        <w:t>The full worksheet and the data files for this lab are in labs/07 - Detailed Process Mapping and Swimlane Analysis/.</w:t>
       </w:r>
     </w:p>
     <w:p/>
@@ -4140,7 +4140,7 @@
         <w:rPr>
           <w:sz w:val="20"/>
         </w:rPr>
-        <w:t>The full worksheet and the data files for this lab are in labs/lab-08-value-stream-mapping-takt-time-and-the-eight-wastes/.</w:t>
+        <w:t>The full worksheet and the data files for this lab are in labs/08 - Value Stream Mapping, Takt Time and the Eight Wastes/.</w:t>
       </w:r>
     </w:p>
     <w:p/>
@@ -4404,7 +4404,7 @@
         <w:rPr>
           <w:sz w:val="20"/>
         </w:rPr>
-        <w:t>The full worksheet and the data files for this lab are in labs/lab-09-data-types-operational-definitions-and-the-data-collection-p/.</w:t>
+        <w:t>The full worksheet and the data files for this lab are in labs/09 - Data Types, Operational Definitions and the Data Collection Plan/.</w:t>
       </w:r>
     </w:p>
     <w:p/>
@@ -4693,7 +4693,7 @@
         <w:rPr>
           <w:sz w:val="20"/>
         </w:rPr>
-        <w:t>The full worksheet and the data files for this lab are in labs/lab-10-sampling-techniques-and-sample-size-calculation/.</w:t>
+        <w:t>The full worksheet and the data files for this lab are in labs/10 - Sampling Techniques and Sample Size Calculation/.</w:t>
       </w:r>
     </w:p>
     <w:p/>
@@ -4987,7 +4987,7 @@
         <w:rPr>
           <w:sz w:val="20"/>
         </w:rPr>
-        <w:t>The full worksheet and the data files for this lab are in labs/lab-11-measurement-system-analysis-and-gage-rr/.</w:t>
+        <w:t>The full worksheet and the data files for this lab are in labs/11 - Measurement System Analysis and Gage R&amp;R/.</w:t>
       </w:r>
     </w:p>
     <w:p/>
@@ -5291,7 +5291,7 @@
         <w:rPr>
           <w:sz w:val="20"/>
         </w:rPr>
-        <w:t>The full worksheet and the data files for this lab are in labs/lab-12-yield-dpu-dpo-dpmo-rty-and-the-hidden-factory/.</w:t>
+        <w:t>The full worksheet and the data files for this lab are in labs/12 - Yield, DPU, DPO, DPMO, RTY and the Hidden Factory/.</w:t>
       </w:r>
     </w:p>
     <w:p/>
@@ -5625,7 +5625,7 @@
         <w:rPr>
           <w:sz w:val="20"/>
         </w:rPr>
-        <w:t>The full worksheet and the data files for this lab are in labs/lab-13-descriptive-statistics-normality-and-baseline-process-capabi/.</w:t>
+        <w:t>The full worksheet and the data files for this lab are in labs/13 - Descriptive Statistics, Normality and Baseline Process Capability/.</w:t>
       </w:r>
     </w:p>
     <w:p/>
@@ -6029,7 +6029,7 @@
         <w:rPr>
           <w:sz w:val="20"/>
         </w:rPr>
-        <w:t>The full worksheet and the data files for this lab are in labs/lab-14-variation-run-charts-and-stability-analysis/.</w:t>
+        <w:t>The full worksheet and the data files for this lab are in labs/14 - Variation, Run Charts and Stability Analysis/.</w:t>
       </w:r>
     </w:p>
     <w:p/>
@@ -6331,7 +6331,7 @@
         <w:rPr>
           <w:sz w:val="20"/>
         </w:rPr>
-        <w:t>The full worksheet and the data files for this lab are in labs/lab-15-pareto-analysis-stratification-and-boxplots/.</w:t>
+        <w:t>The full worksheet and the data files for this lab are in labs/15 - Pareto Analysis, Stratification and Boxplots/.</w:t>
       </w:r>
     </w:p>
     <w:p/>
@@ -6640,7 +6640,7 @@
         <w:rPr>
           <w:sz w:val="20"/>
         </w:rPr>
-        <w:t>The full worksheet and the data files for this lab are in labs/lab-16-fishbone-5-whys-multivoting-and-cause-prioritisation/.</w:t>
+        <w:t>The full worksheet and the data files for this lab are in labs/16 - Fishbone, 5 Whys, Multi-Voting and Cause Prioritisation/.</w:t>
       </w:r>
     </w:p>
     <w:p/>
@@ -7017,7 +7017,7 @@
         <w:rPr>
           <w:sz w:val="20"/>
         </w:rPr>
-        <w:t>The full worksheet and the data files for this lab are in labs/lab-17-hypothesis-testing-test-selection-pvalues-and-conclusions/.</w:t>
+        <w:t>The full worksheet and the data files for this lab are in labs/17 - Hypothesis Testing — Test Selection, p-values and Conclusions/.</w:t>
       </w:r>
     </w:p>
     <w:p/>
@@ -7356,7 +7356,7 @@
         <w:rPr>
           <w:sz w:val="20"/>
         </w:rPr>
-        <w:t>The full worksheet and the data files for this lab are in labs/lab-18-correlation-regression-and-quantifying-the-xy-relationship/.</w:t>
+        <w:t>The full worksheet and the data files for this lab are in labs/18 - Correlation, Regression and Quantifying the X-Y Relationship/.</w:t>
       </w:r>
     </w:p>
     <w:p/>
@@ -7730,7 +7730,7 @@
         <w:rPr>
           <w:sz w:val="20"/>
         </w:rPr>
-        <w:t>The full worksheet and the data files for this lab are in labs/lab-19-solution-generation-benchmarking-and-brainwriting/.</w:t>
+        <w:t>The full worksheet and the data files for this lab are in labs/19 - Solution Generation, Benchmarking and Brainwriting/.</w:t>
       </w:r>
     </w:p>
     <w:p/>
@@ -8024,7 +8024,7 @@
         <w:rPr>
           <w:sz w:val="20"/>
         </w:rPr>
-        <w:t>The full worksheet and the data files for this lab are in labs/lab-20-lean-countermeasures-5s-pokayoke-pull-jit-and-standard-work/.</w:t>
+        <w:t>The full worksheet and the data files for this lab are in labs/20 - Lean Countermeasures — 5S, Poka-Yoke, Pull, JIT and Standard Work/.</w:t>
       </w:r>
     </w:p>
     <w:p/>
@@ -8333,7 +8333,7 @@
         <w:rPr>
           <w:sz w:val="20"/>
         </w:rPr>
-        <w:t>The full worksheet and the data files for this lab are in labs/lab-21-solution-selection-matrix-and-costbenefit-analysis/.</w:t>
+        <w:t>The full worksheet and the data files for this lab are in labs/21 - Solution Selection Matrix and Cost-Benefit Analysis/.</w:t>
       </w:r>
     </w:p>
     <w:p/>
@@ -8725,7 +8725,7 @@
         <w:rPr>
           <w:sz w:val="20"/>
         </w:rPr>
-        <w:t>The full worksheet and the data files for this lab are in labs/lab-22-fmea-risk-priority-numbers-doe-and-piloting/.</w:t>
+        <w:t>The full worksheet and the data files for this lab are in labs/22 - FMEA, Risk Priority Numbers, DOE and Piloting/.</w:t>
       </w:r>
     </w:p>
     <w:p/>
@@ -9219,7 +9219,7 @@
         <w:rPr>
           <w:sz w:val="20"/>
         </w:rPr>
-        <w:t>The full worksheet and the data files for this lab are in labs/lab-23-statistical-process-control-chart-selection-and-control-limi/.</w:t>
+        <w:t>The full worksheet and the data files for this lab are in labs/23 - Statistical Process Control — Chart Selection and Control Limits/.</w:t>
       </w:r>
     </w:p>
     <w:p/>
@@ -9558,7 +9558,7 @@
         <w:rPr>
           <w:sz w:val="20"/>
         </w:rPr>
-        <w:t>The full worksheet and the data files for this lab are in labs/lab-24-control-plan-sop-visual-management-and-response-plan/.</w:t>
+        <w:t>The full worksheet and the data files for this lab are in labs/24 - Control Plan, SOP, Visual Management and Response Plan/.</w:t>
       </w:r>
     </w:p>
     <w:p/>
@@ -9927,7 +9927,7 @@
         <w:rPr>
           <w:sz w:val="20"/>
         </w:rPr>
-        <w:t>The full worksheet and the data files for this lab are in labs/lab-25-verify-the-gain-a3-storyboard-handover-and-project-closure/.</w:t>
+        <w:t>The full worksheet and the data files for this lab are in labs/25 - Verify the Gain, A3 Storyboard, Handover and Project Closure/.</w:t>
       </w:r>
     </w:p>
     <w:p/>

</xml_diff>